<commit_message>
Expert system: situation assessment drives all outputs
Adds a structured situation questionnaire (margin trend, revenue
driver, concentration, capacity, cost program, competition, urgency)
and a scored opportunity library, so different situations produce
genuinely different findings, interview questions, and presentations.
Long pasted context becomes its own Analyst notes section instead of
breaking framing sentences. Demo numbers now require explicit consent
for named companies, and financials can be typed manually.

Co-Authored-By: Claude Fable 5 <noreply@anthropic.com>
</commit_message>
<xml_diff>
--- a/samples/financial_Business_Summary.docx
+++ b/samples/financial_Business_Summary.docx
@@ -175,7 +175,7 @@
                 <w:szCs w:val="21"/>
                 <w:rFonts w:ascii="Arial" w:cs="Arial" w:eastAsia="Arial" w:hAnsi="Arial"/>
               </w:rPr>
-              <w:t xml:space="preserve">1. Top line growth: </w:t>
+              <w:t xml:space="preserve">1. Top line: </w:t>
             </w:r>
             <w:r>
               <w:rPr>
@@ -188,7 +188,7 @@
                 <w:szCs w:val="21"/>
                 <w:rFonts w:ascii="Arial" w:cs="Arial" w:eastAsia="Arial" w:hAnsi="Arial"/>
               </w:rPr>
-              <w:t xml:space="preserve">Revenue grew from $142.0M (2021) to $183.0M (2024), a 8.8% CAGR; confirm how much is volume vs. price (see Section 3).</w:t>
+              <w:t xml:space="preserve">Revenue grew from $142.0M in 2021 to $183.0M in 2024, a healthy 8.8% compound annual growth rate. See Section 2.</w:t>
             </w:r>
           </w:p>
           <w:p>
@@ -219,7 +219,7 @@
                 <w:szCs w:val="21"/>
                 <w:rFonts w:ascii="Arial" w:cs="Arial" w:eastAsia="Arial" w:hAnsi="Arial"/>
               </w:rPr>
-              <w:t xml:space="preserve">EBITDA of $34.3M implies a 18.7% margin in 2024; within a typical range, with improvement potential after close (see Section 3).</w:t>
+              <w:t xml:space="preserve">EBITDA margin of 18.7% is within a typical range, with room for operational improvement after close. See Section 2.</w:t>
             </w:r>
           </w:p>
           <w:p>
@@ -250,7 +250,7 @@
                 <w:szCs w:val="21"/>
                 <w:rFonts w:ascii="Arial" w:cs="Arial" w:eastAsia="Arial" w:hAnsi="Arial"/>
               </w:rPr>
-              <w:t xml:space="preserve">Operational dependencies and management retention determine speed to value; both are unconfirmed at this stage (see Section 4).</w:t>
+              <w:t xml:space="preserve">Operational dependencies and management retention determine speed to value; both are unconfirmed at this stage.</w:t>
             </w:r>
           </w:p>
           <w:p>
@@ -281,7 +281,7 @@
                 <w:szCs w:val="21"/>
                 <w:rFonts w:ascii="Arial" w:cs="Arial" w:eastAsia="Arial" w:hAnsi="Arial"/>
               </w:rPr>
-              <w:t xml:space="preserve">Procurement scale is the highest confidence synergy opportunity; revenue synergies should be treated as upside, not base case (see the synergy presentation).</w:t>
+              <w:t xml:space="preserve">Procurement scale and vendor consolidation scores highest for this situation on impact and achievability; see the accompanying presentation for the ranked view.</w:t>
             </w:r>
           </w:p>
         </w:tc>
@@ -2347,7 +2347,7 @@
           <w:szCs w:val="21"/>
           <w:rFonts w:ascii="Arial" w:cs="Arial" w:eastAsia="Arial" w:hAnsi="Arial"/>
         </w:rPr>
-        <w:t xml:space="preserve">Customer and supplier concentration: confirm the share of revenue tied to the top five relationships.</w:t>
+        <w:t xml:space="preserve">Integration readiness: Operational dependencies and management retention determine speed to value; both are unconfirmed at this stage.</w:t>
       </w:r>
     </w:p>
     <w:p>
@@ -2370,7 +2370,7 @@
           <w:szCs w:val="21"/>
           <w:rFonts w:ascii="Arial" w:cs="Arial" w:eastAsia="Arial" w:hAnsi="Arial"/>
         </w:rPr>
-        <w:t xml:space="preserve">Integration readiness: identify the operational dependencies that determine speed to value.</w:t>
+        <w:t xml:space="preserve">Customer and supplier concentration: confirm the share of revenue tied to the top five relationships.</w:t>
       </w:r>
     </w:p>
     <w:p>

</xml_diff>

<commit_message>
Fix doubled framing sentences and deck text overflow
Contexts that already read as framing sentences are used as the frame
instead of being embedded after 'to', which doubled the subject. The
financial overview no longer repeats the sector sentence. Every long
text box in the deck now carries shrink autofit, verified by a
geometry checker across twelve generated scenarios. Thin margin high
COGS businesses no longer trigger a false caution verdict.

Co-Authored-By: Claude Fable 5 <noreply@anthropic.com>
</commit_message>
<xml_diff>
--- a/samples/financial_Business_Summary.docx
+++ b/samples/financial_Business_Summary.docx
@@ -95,7 +95,7 @@
           <w:szCs w:val="21"/>
           <w:rFonts w:ascii="Arial" w:cs="Arial" w:eastAsia="Arial" w:hAnsi="Arial"/>
         </w:rPr>
-        <w:t xml:space="preserve">The client is evaluating the acquisition of Meridian Components Inc. to expand into the Midwest market with meaningful procurement synergies.</w:t>
+        <w:t xml:space="preserve">The client is evaluating the acquisition of Meridian Components Inc., with a focus on expand into the Midwest market with meaningful procurement synergies.</w:t>
       </w:r>
     </w:p>
     <w:p>
@@ -113,7 +113,7 @@
           <w:szCs w:val="21"/>
           <w:rFonts w:ascii="Arial" w:cs="Arial" w:eastAsia="Arial" w:hAnsi="Arial"/>
         </w:rPr>
-        <w:t xml:space="preserve">Meridian Components Inc. operates in the industrial manufacturing sector with reported revenue of $183.0M in FY24A. Meridian Components Inc. operates in the industrial manufacturing sector; the analysis focuses on quality of earnings, deal perimeter, and value creation levers.</w:t>
+        <w:t xml:space="preserve">Meridian Components Inc. operates in the industrial manufacturing sector with reported revenue of $183.0M in FY24A. The analysis focuses on quality of earnings, deal perimeter, and value creation levers.</w:t>
       </w:r>
     </w:p>
     <w:tbl>

</xml_diff>

<commit_message>
Output quality round: charts, formula rows, deduplicated findings
The deck summary slide now carries real data visualization: a revenue
column chart and a separate EBITDA margin line chart, single series
each, directly labeled, no gridlines. The business summary findings
box compresses to one liners instead of repeating Section 2, and the
financial table gains a revenue growth percent row. The Excel
workbook gains live growth and margin formula rows in Historicals and
a total as percent of revenue row in the model.

Co-Authored-By: Claude Fable 5 <noreply@anthropic.com>
</commit_message>
<xml_diff>
--- a/samples/financial_Business_Summary.docx
+++ b/samples/financial_Business_Summary.docx
@@ -188,7 +188,7 @@
                 <w:szCs w:val="21"/>
                 <w:rFonts w:ascii="Arial" w:cs="Arial" w:eastAsia="Arial" w:hAnsi="Arial"/>
               </w:rPr>
-              <w:t xml:space="preserve">Revenue grew from $142.0M in 2021 to $183.0M in 2024, a healthy 8.8% compound annual growth rate. See Section 2.</w:t>
+              <w:t xml:space="preserve">Revenue $142.0M (2021) to $183.0M (2024), a 8.8% CAGR; detail in Section 2.</w:t>
             </w:r>
           </w:p>
           <w:p>
@@ -219,7 +219,7 @@
                 <w:szCs w:val="21"/>
                 <w:rFonts w:ascii="Arial" w:cs="Arial" w:eastAsia="Arial" w:hAnsi="Arial"/>
               </w:rPr>
-              <w:t xml:space="preserve">EBITDA margin of 18.7% is within a typical range, with room for operational improvement after close. See Section 2.</w:t>
+              <w:t xml:space="preserve">EBITDA $34.3M at a 18.7% margin in 2024, within a typical range; detail in Section 2.</w:t>
             </w:r>
           </w:p>
           <w:p>
@@ -281,7 +281,7 @@
                 <w:szCs w:val="21"/>
                 <w:rFonts w:ascii="Arial" w:cs="Arial" w:eastAsia="Arial" w:hAnsi="Arial"/>
               </w:rPr>
-              <w:t xml:space="preserve">Procurement scale and vendor consolidation scores highest for this situation on impact and achievability; see the accompanying presentation for the ranked view.</w:t>
+              <w:t xml:space="preserve">Procurement scale and vendor consolidation scores highest for this situation on impact and achievability; ranked view in the accompanying presentation.</w:t>
             </w:r>
           </w:p>
         </w:tc>
@@ -718,6 +718,182 @@
                 <w:rFonts w:ascii="Arial" w:cs="Arial" w:eastAsia="Arial" w:hAnsi="Arial"/>
               </w:rPr>
               <w:t xml:space="preserve">199.1</w:t>
+            </w:r>
+          </w:p>
+        </w:tc>
+      </w:tr>
+      <w:tr>
+        <w:tc>
+          <w:tcPr>
+            <w:tcMar>
+              <w:top w:type="dxa" w:w="80"/>
+              <w:left w:type="dxa" w:w="120"/>
+              <w:bottom w:type="dxa" w:w="80"/>
+              <w:right w:type="dxa" w:w="120"/>
+            </w:tcMar>
+          </w:tcPr>
+          <w:p>
+            <w:pPr>
+              <w:spacing w:after="0"/>
+              <w:jc w:val="left"/>
+            </w:pPr>
+            <w:r>
+              <w:rPr>
+                <w:b w:val="false"/>
+                <w:bCs w:val="false"/>
+                <w:i w:val="false"/>
+                <w:iCs w:val="false"/>
+                <w:color w:val="1A1A1A"/>
+                <w:sz w:val="19"/>
+                <w:szCs w:val="19"/>
+                <w:rFonts w:ascii="Arial" w:cs="Arial" w:eastAsia="Arial" w:hAnsi="Arial"/>
+              </w:rPr>
+              <w:t xml:space="preserve">Revenue growth (%)</w:t>
+            </w:r>
+          </w:p>
+        </w:tc>
+        <w:tc>
+          <w:tcPr>
+            <w:tcMar>
+              <w:top w:type="dxa" w:w="80"/>
+              <w:left w:type="dxa" w:w="120"/>
+              <w:bottom w:type="dxa" w:w="80"/>
+              <w:right w:type="dxa" w:w="120"/>
+            </w:tcMar>
+          </w:tcPr>
+          <w:p>
+            <w:pPr>
+              <w:spacing w:after="0"/>
+              <w:jc w:val="right"/>
+            </w:pPr>
+            <w:r>
+              <w:rPr>
+                <w:b w:val="false"/>
+                <w:bCs w:val="false"/>
+                <w:i w:val="false"/>
+                <w:iCs w:val="false"/>
+                <w:color w:val="1A1A1A"/>
+                <w:sz w:val="19"/>
+                <w:szCs w:val="19"/>
+                <w:rFonts w:ascii="Arial" w:cs="Arial" w:eastAsia="Arial" w:hAnsi="Arial"/>
+              </w:rPr>
+              <w:t xml:space="preserve">n/a</w:t>
+            </w:r>
+          </w:p>
+        </w:tc>
+        <w:tc>
+          <w:tcPr>
+            <w:tcMar>
+              <w:top w:type="dxa" w:w="80"/>
+              <w:left w:type="dxa" w:w="120"/>
+              <w:bottom w:type="dxa" w:w="80"/>
+              <w:right w:type="dxa" w:w="120"/>
+            </w:tcMar>
+          </w:tcPr>
+          <w:p>
+            <w:pPr>
+              <w:spacing w:after="0"/>
+              <w:jc w:val="right"/>
+            </w:pPr>
+            <w:r>
+              <w:rPr>
+                <w:b w:val="false"/>
+                <w:bCs w:val="false"/>
+                <w:i w:val="false"/>
+                <w:iCs w:val="false"/>
+                <w:color w:val="1A1A1A"/>
+                <w:sz w:val="19"/>
+                <w:szCs w:val="19"/>
+                <w:rFonts w:ascii="Arial" w:cs="Arial" w:eastAsia="Arial" w:hAnsi="Arial"/>
+              </w:rPr>
+              <w:t xml:space="preserve">8.5%</w:t>
+            </w:r>
+          </w:p>
+        </w:tc>
+        <w:tc>
+          <w:tcPr>
+            <w:tcMar>
+              <w:top w:type="dxa" w:w="80"/>
+              <w:left w:type="dxa" w:w="120"/>
+              <w:bottom w:type="dxa" w:w="80"/>
+              <w:right w:type="dxa" w:w="120"/>
+            </w:tcMar>
+          </w:tcPr>
+          <w:p>
+            <w:pPr>
+              <w:spacing w:after="0"/>
+              <w:jc w:val="right"/>
+            </w:pPr>
+            <w:r>
+              <w:rPr>
+                <w:b w:val="false"/>
+                <w:bCs w:val="false"/>
+                <w:i w:val="false"/>
+                <w:iCs w:val="false"/>
+                <w:color w:val="1A1A1A"/>
+                <w:sz w:val="19"/>
+                <w:szCs w:val="19"/>
+                <w:rFonts w:ascii="Arial" w:cs="Arial" w:eastAsia="Arial" w:hAnsi="Arial"/>
+              </w:rPr>
+              <w:t xml:space="preserve">9.1%</w:t>
+            </w:r>
+          </w:p>
+        </w:tc>
+        <w:tc>
+          <w:tcPr>
+            <w:tcMar>
+              <w:top w:type="dxa" w:w="80"/>
+              <w:left w:type="dxa" w:w="120"/>
+              <w:bottom w:type="dxa" w:w="80"/>
+              <w:right w:type="dxa" w:w="120"/>
+            </w:tcMar>
+          </w:tcPr>
+          <w:p>
+            <w:pPr>
+              <w:spacing w:after="0"/>
+              <w:jc w:val="right"/>
+            </w:pPr>
+            <w:r>
+              <w:rPr>
+                <w:b w:val="false"/>
+                <w:bCs w:val="false"/>
+                <w:i w:val="false"/>
+                <w:iCs w:val="false"/>
+                <w:color w:val="1A1A1A"/>
+                <w:sz w:val="19"/>
+                <w:szCs w:val="19"/>
+                <w:rFonts w:ascii="Arial" w:cs="Arial" w:eastAsia="Arial" w:hAnsi="Arial"/>
+              </w:rPr>
+              <w:t xml:space="preserve">8.9%</w:t>
+            </w:r>
+          </w:p>
+        </w:tc>
+        <w:tc>
+          <w:tcPr>
+            <w:tcMar>
+              <w:top w:type="dxa" w:w="80"/>
+              <w:left w:type="dxa" w:w="120"/>
+              <w:bottom w:type="dxa" w:w="80"/>
+              <w:right w:type="dxa" w:w="120"/>
+            </w:tcMar>
+          </w:tcPr>
+          <w:p>
+            <w:pPr>
+              <w:spacing w:after="0"/>
+              <w:jc w:val="right"/>
+            </w:pPr>
+            <w:r>
+              <w:rPr>
+                <w:b w:val="false"/>
+                <w:bCs w:val="false"/>
+                <w:i w:val="false"/>
+                <w:iCs w:val="false"/>
+                <w:color w:val="1A1A1A"/>
+                <w:sz w:val="19"/>
+                <w:szCs w:val="19"/>
+                <w:rFonts w:ascii="Arial" w:cs="Arial" w:eastAsia="Arial" w:hAnsi="Arial"/>
+              </w:rPr>
+              <w:t xml:space="preserve">8.8%</w:t>
             </w:r>
           </w:p>
         </w:tc>

</xml_diff>

<commit_message>
Logo color extraction plus prose quality round
Uploading a client logo now extracts its brand colors with canvas
pixel analysis (dark dominant becomes primary, most saturated
distinct color becomes accent, pale primaries auto darken) and
applies them as the design scheme, switching output to client
branded mode. The branded secondary color derives from the accent
so charts stay in the brand family. Prose round: contexts embed as
lowercased phrases or become Background sentences when they carry
their own verb; lead hypotheses are quoted; negative money renders
as -$90.0M; a/an agrees before 8, 11, and 18; pause verdicts get
diagnostic next steps; thin margins on high COGS models are called
typical rather than alarming.

Co-Authored-By: Claude Fable 5 <noreply@anthropic.com>
</commit_message>
<xml_diff>
--- a/samples/financial_Business_Summary.docx
+++ b/samples/financial_Business_Summary.docx
@@ -188,7 +188,7 @@
                 <w:szCs w:val="21"/>
                 <w:rFonts w:ascii="Arial" w:cs="Arial" w:eastAsia="Arial" w:hAnsi="Arial"/>
               </w:rPr>
-              <w:t xml:space="preserve">Revenue $142.0M (2021) to $183.0M (2024), a 8.8% CAGR; detail in Section 2.</w:t>
+              <w:t xml:space="preserve">Revenue $142.0M (2021) to $183.0M (2024), an 8.8% CAGR; detail in Section 2.</w:t>
             </w:r>
           </w:p>
           <w:p>
@@ -219,7 +219,7 @@
                 <w:szCs w:val="21"/>
                 <w:rFonts w:ascii="Arial" w:cs="Arial" w:eastAsia="Arial" w:hAnsi="Arial"/>
               </w:rPr>
-              <w:t xml:space="preserve">EBITDA $34.3M at a 18.7% margin in 2024, within a typical range; detail in Section 2.</w:t>
+              <w:t xml:space="preserve">EBITDA $34.3M at an 18.7% margin in 2024, within a typical range; detail in Section 2.</w:t>
             </w:r>
           </w:p>
           <w:p>
@@ -281,7 +281,7 @@
                 <w:szCs w:val="21"/>
                 <w:rFonts w:ascii="Arial" w:cs="Arial" w:eastAsia="Arial" w:hAnsi="Arial"/>
               </w:rPr>
-              <w:t xml:space="preserve">Procurement scale and vendor consolidation scores highest for this situation on impact and achievability; ranked view in the accompanying presentation.</w:t>
+              <w:t xml:space="preserve">"Procurement scale and vendor consolidation" scores highest for this situation on impact and achievability; ranked view in the accompanying presentation.</w:t>
             </w:r>
           </w:p>
         </w:tc>

</xml_diff>

<commit_message>
User reported round: real slide fitting, styled linked model, profiles
PowerPoint text no longer relies on autofit, which PowerPoint ignores
until a box is edited: font sizes are precomputed to fit each box and
the geometry checker now runs strict. The Excel model is rebuilt on a
style capable library as four linked sheets: Inputs with yellow
editable cells including EV to EBITDA and revenue multiples, Model
with historicals plus a five year projection, Synergies scenarios,
and Valuation showing value creation from synergy capture, every
number a live formula. Company lookup now pulls key products and best
effort recent news; a manual profile section covers private company
people, products, and news. Manual entry labels each row in millions.

Co-Authored-By: Claude Fable 5 <noreply@anthropic.com>
</commit_message>
<xml_diff>
--- a/samples/financial_Business_Summary.docx
+++ b/samples/financial_Business_Summary.docx
@@ -1892,7 +1892,7 @@
                 <w:szCs w:val="19"/>
                 <w:rFonts w:ascii="Arial" w:cs="Arial" w:eastAsia="Arial" w:hAnsi="Arial"/>
               </w:rPr>
-              <w:t xml:space="preserve">Chief Financial Officer</w:t>
+              <w:t xml:space="preserve">Chair of the Board</w:t>
             </w:r>
           </w:p>
         </w:tc>
@@ -1950,7 +1950,7 @@
                 <w:szCs w:val="19"/>
                 <w:rFonts w:ascii="Arial" w:cs="Arial" w:eastAsia="Arial" w:hAnsi="Arial"/>
               </w:rPr>
-              <w:t xml:space="preserve">Chief Operating Officer</w:t>
+              <w:t xml:space="preserve">Chief Financial Officer</w:t>
             </w:r>
           </w:p>
         </w:tc>
@@ -2523,7 +2523,7 @@
           <w:szCs w:val="21"/>
           <w:rFonts w:ascii="Arial" w:cs="Arial" w:eastAsia="Arial" w:hAnsi="Arial"/>
         </w:rPr>
-        <w:t xml:space="preserve">Integration readiness: Operational dependencies and management retention determine speed to value; both are unconfirmed at this stage.</w:t>
+        <w:t xml:space="preserve">Customer and supplier concentration: confirm the share of revenue tied to the top five relationships.</w:t>
       </w:r>
     </w:p>
     <w:p>
@@ -2546,7 +2546,7 @@
           <w:szCs w:val="21"/>
           <w:rFonts w:ascii="Arial" w:cs="Arial" w:eastAsia="Arial" w:hAnsi="Arial"/>
         </w:rPr>
-        <w:t xml:space="preserve">Customer and supplier concentration: confirm the share of revenue tied to the top five relationships.</w:t>
+        <w:t xml:space="preserve">Quality of reported figures: confirm accounting basis, one time items, and any restatements.</w:t>
       </w:r>
     </w:p>
     <w:p>

</xml_diff>